<commit_message>
refactor: modularizza app.py, fix pin versioni e bug mutuo disattivato
- app.py diviso in ui_sidebar.py (widget + scenari), ui_tabs.py (4 tab
  + export), utils.py (fmt); app.py ora è solo orchestratore
- fix: crash NameError se si disattiva "Includi Mutuo" (eta_rich,
  classe_ape, taeg_val, reddito_mensile non erano definiti fuori dal
  ramo usa_mutuo)
- engine.py: nuova colonna Valore_Mercato_Immobile nella proiezione
  (prima il valore di mercato "vero" veniva scartato se era impostato
  un prezzo di vendita fisso); estratta calcola_rendimenti_per_anno()
- requirements.txt: pin esatto plotly==6.9.0 e kaleido==1.4.0 (evita
  rotture come nel commit 518a5f7)
- tooltip e riepilogo chiariscono che la rivalutazione si applica
  anche col prezzo di vendita fisso
- tabelle "Entrate Stimate" senza più indice numerico superfluo
- rimosso riferimento hardcoded "Via Michelangelo Osimo" dal footer
- README.md e MANUALE_FORMULE.docx allineati alle modifiche sopra
</commit_message>
<xml_diff>
--- a/MANUALE_FORMULE.docx
+++ b/MANUALE_FORMULE.docx
@@ -823,7 +823,26 @@
     </w:p>
     <w:p>
       <w:r>
-        <w:t>Se l'utente inserisce un Prezzo di Vendita fisso &gt; 0, questo sostituisce il valore calcolato.</w:t>
+        <w:t>Se l'utente inserisce un Prezzo di Vendita fisso &gt; 0, questo viene rivalutato annualmente con la stessa formula:</w:t>
+      </w:r>
+    </w:p>
+    <w:p>
+      <w:pPr>
+        <w:spacing w:before="80" w:after="80"/>
+        <w:ind w:left="567"/>
+      </w:pPr>
+      <w:r>
+        <w:rPr>
+          <w:rFonts w:ascii="Consolas" w:hAnsi="Consolas"/>
+          <w:color w:val="333333"/>
+          <w:sz w:val="18"/>
+        </w:rPr>
+        <w:t>Prezzo Vendita Effettivo = Prezzo di Vendita × (1 + Rivalutazione Annua)^t</w:t>
+      </w:r>
+    </w:p>
+    <w:p>
+      <w:r>
+        <w:t>In questo modo la rivalutazione si applica sia al valore di mercato stimato sia al prezzo di vendita fisso inserito dall'utente.</w:t>
       </w:r>
     </w:p>
     <w:p>

</xml_diff>